<commit_message>
docs: bulk results from CI, and cross-machine determinism
GitHub's shared runners give 20,161 and 19,330 msg/sec against 111,732
and 129,870 locally, five to six times slower, which is why throughput is
only ever compared against itself.

The enriched and flagged counts came back identical to the local run:
9,717 / 10,283 at 20,000 and 14,529 / 15,471 at 30,000. Same seed,
different hardware, same distribution to the message. That demonstrates
the determinism requirement rather than asserting it.
</commit_message>
<xml_diff>
--- a/docs/ARCHITECTURE.docx
+++ b/docs/ARCHITECTURE.docx
@@ -7055,6 +7055,339 @@
           <w:lang w:val="en-GB"/>
         </w:rPr>
         <w:t xml:space="preserve">tagged test: 123 tests.</w:t>
+      </w:r>
+    </w:p>
+    <w:p>
+      <w:pPr>
+        <w:pStyle w:val="BodyText"/>
+      </w:pPr>
+      <w:r>
+        <w:rPr>
+          <w:lang w:val="en-GB"/>
+        </w:rPr>
+        <w:t xml:space="preserve">The same two runs on GitHub's shared runners:</w:t>
+      </w:r>
+    </w:p>
+    <w:tbl>
+      <w:tblPr>
+        <w:tblStyle w:val="Table"/>
+        <w:tblW w:type="auto" w:w="0"/>
+        <w:tblLook w:firstRow="1" w:lastRow="0" w:firstColumn="0" w:lastColumn="0" w:noHBand="0" w:noVBand="0" w:val="0020"/>
+      </w:tblPr>
+      <w:tblGrid>
+        <w:gridCol w:w="1584"/>
+        <w:gridCol w:w="1584"/>
+        <w:gridCol w:w="1584"/>
+        <w:gridCol w:w="1584"/>
+        <w:gridCol w:w="1584"/>
+      </w:tblGrid>
+      <w:tr>
+        <w:trPr>
+          <w:tblHeader w:val="on"/>
+        </w:trPr>
+        <w:tc>
+          <w:tcPr/>
+          <w:p>
+            <w:pPr>
+              <w:pStyle w:val="Compact"/>
+            </w:pPr>
+            <w:r>
+              <w:rPr>
+                <w:lang w:val="en-GB"/>
+              </w:rPr>
+              <w:t xml:space="preserve">Messages</w:t>
+            </w:r>
+          </w:p>
+        </w:tc>
+        <w:tc>
+          <w:tcPr/>
+          <w:p>
+            <w:pPr>
+              <w:pStyle w:val="Compact"/>
+            </w:pPr>
+            <w:r>
+              <w:rPr>
+                <w:lang w:val="en-GB"/>
+              </w:rPr>
+              <w:t xml:space="preserve">Load + process</w:t>
+            </w:r>
+          </w:p>
+        </w:tc>
+        <w:tc>
+          <w:tcPr/>
+          <w:p>
+            <w:pPr>
+              <w:pStyle w:val="Compact"/>
+            </w:pPr>
+            <w:r>
+              <w:rPr>
+                <w:lang w:val="en-GB"/>
+              </w:rPr>
+              <w:t xml:space="preserve">Throughput</w:t>
+            </w:r>
+          </w:p>
+        </w:tc>
+        <w:tc>
+          <w:tcPr/>
+          <w:p>
+            <w:pPr>
+              <w:pStyle w:val="Compact"/>
+            </w:pPr>
+            <w:r>
+              <w:rPr>
+                <w:lang w:val="en-GB"/>
+              </w:rPr>
+              <w:t xml:space="preserve">Enriched</w:t>
+            </w:r>
+          </w:p>
+        </w:tc>
+        <w:tc>
+          <w:tcPr/>
+          <w:p>
+            <w:pPr>
+              <w:pStyle w:val="Compact"/>
+            </w:pPr>
+            <w:r>
+              <w:rPr>
+                <w:lang w:val="en-GB"/>
+              </w:rPr>
+              <w:t xml:space="preserve">Flagged</w:t>
+            </w:r>
+          </w:p>
+        </w:tc>
+      </w:tr>
+      <w:tr>
+        <w:tc>
+          <w:tcPr/>
+          <w:p>
+            <w:pPr>
+              <w:pStyle w:val="Compact"/>
+            </w:pPr>
+            <w:r>
+              <w:rPr>
+                <w:lang w:val="en-GB"/>
+              </w:rPr>
+              <w:t xml:space="preserve">20 000</w:t>
+            </w:r>
+          </w:p>
+        </w:tc>
+        <w:tc>
+          <w:tcPr/>
+          <w:p>
+            <w:pPr>
+              <w:pStyle w:val="Compact"/>
+            </w:pPr>
+            <w:r>
+              <w:rPr>
+                <w:lang w:val="en-GB"/>
+              </w:rPr>
+              <w:t xml:space="preserve">992 ms</w:t>
+            </w:r>
+          </w:p>
+        </w:tc>
+        <w:tc>
+          <w:tcPr/>
+          <w:p>
+            <w:pPr>
+              <w:pStyle w:val="Compact"/>
+            </w:pPr>
+            <w:r>
+              <w:rPr>
+                <w:lang w:val="en-GB"/>
+              </w:rPr>
+              <w:t xml:space="preserve">20 161 msg/sec</w:t>
+            </w:r>
+          </w:p>
+        </w:tc>
+        <w:tc>
+          <w:tcPr/>
+          <w:p>
+            <w:pPr>
+              <w:pStyle w:val="Compact"/>
+            </w:pPr>
+            <w:r>
+              <w:rPr>
+                <w:lang w:val="en-GB"/>
+              </w:rPr>
+              <w:t xml:space="preserve">9 717</w:t>
+            </w:r>
+          </w:p>
+        </w:tc>
+        <w:tc>
+          <w:tcPr/>
+          <w:p>
+            <w:pPr>
+              <w:pStyle w:val="Compact"/>
+            </w:pPr>
+            <w:r>
+              <w:rPr>
+                <w:lang w:val="en-GB"/>
+              </w:rPr>
+              <w:t xml:space="preserve">10 283</w:t>
+            </w:r>
+          </w:p>
+        </w:tc>
+      </w:tr>
+      <w:tr>
+        <w:tc>
+          <w:tcPr/>
+          <w:p>
+            <w:pPr>
+              <w:pStyle w:val="Compact"/>
+            </w:pPr>
+            <w:r>
+              <w:rPr>
+                <w:lang w:val="en-GB"/>
+              </w:rPr>
+              <w:t xml:space="preserve">30 000</w:t>
+            </w:r>
+          </w:p>
+        </w:tc>
+        <w:tc>
+          <w:tcPr/>
+          <w:p>
+            <w:pPr>
+              <w:pStyle w:val="Compact"/>
+            </w:pPr>
+            <w:r>
+              <w:rPr>
+                <w:lang w:val="en-GB"/>
+              </w:rPr>
+              <w:t xml:space="preserve">1 552 ms</w:t>
+            </w:r>
+          </w:p>
+        </w:tc>
+        <w:tc>
+          <w:tcPr/>
+          <w:p>
+            <w:pPr>
+              <w:pStyle w:val="Compact"/>
+            </w:pPr>
+            <w:r>
+              <w:rPr>
+                <w:lang w:val="en-GB"/>
+              </w:rPr>
+              <w:t xml:space="preserve">19 330 msg/sec</w:t>
+            </w:r>
+          </w:p>
+        </w:tc>
+        <w:tc>
+          <w:tcPr/>
+          <w:p>
+            <w:pPr>
+              <w:pStyle w:val="Compact"/>
+            </w:pPr>
+            <w:r>
+              <w:rPr>
+                <w:lang w:val="en-GB"/>
+              </w:rPr>
+              <w:t xml:space="preserve">14 529</w:t>
+            </w:r>
+          </w:p>
+        </w:tc>
+        <w:tc>
+          <w:tcPr/>
+          <w:p>
+            <w:pPr>
+              <w:pStyle w:val="Compact"/>
+            </w:pPr>
+            <w:r>
+              <w:rPr>
+                <w:lang w:val="en-GB"/>
+              </w:rPr>
+              <w:t xml:space="preserve">15 471</w:t>
+            </w:r>
+          </w:p>
+        </w:tc>
+      </w:tr>
+    </w:tbl>
+    <w:p>
+      <w:pPr>
+        <w:pStyle w:val="BodyText"/>
+      </w:pPr>
+      <w:r>
+        <w:rPr>
+          <w:lang w:val="en-GB"/>
+        </w:rPr>
+        <w:t xml:space="preserve">Throughput is five to six times lower on shared CI hardware, which is expected and</w:t>
+      </w:r>
+      <w:r>
+        <w:rPr>
+          <w:lang w:val="en-GB"/>
+        </w:rPr>
+        <w:t xml:space="preserve"> </w:t>
+      </w:r>
+      <w:r>
+        <w:rPr>
+          <w:lang w:val="en-GB"/>
+        </w:rPr>
+        <w:t xml:space="preserve">is why the figure is only ever compared against itself.</w:t>
+      </w:r>
+      <w:r>
+        <w:rPr>
+          <w:lang w:val="en-GB"/>
+        </w:rPr>
+        <w:t xml:space="preserve"> </w:t>
+      </w:r>
+      <w:r>
+        <w:rPr>
+          <w:b/>
+          <w:bCs/>
+          <w:lang w:val="en-GB"/>
+        </w:rPr>
+        <w:t xml:space="preserve">The enriched and flagged</w:t>
+      </w:r>
+      <w:r>
+        <w:rPr>
+          <w:b/>
+          <w:bCs/>
+          <w:lang w:val="en-GB"/>
+        </w:rPr>
+        <w:t xml:space="preserve"> </w:t>
+      </w:r>
+      <w:r>
+        <w:rPr>
+          <w:b/>
+          <w:bCs/>
+          <w:lang w:val="en-GB"/>
+        </w:rPr>
+        <w:t xml:space="preserve">counts are identical to the local run.</w:t>
+      </w:r>
+      <w:r>
+        <w:rPr>
+          <w:lang w:val="en-GB"/>
+        </w:rPr>
+        <w:t xml:space="preserve"> </w:t>
+      </w:r>
+      <w:r>
+        <w:rPr>
+          <w:lang w:val="en-GB"/>
+        </w:rPr>
+        <w:t xml:space="preserve">Same seed, entirely different machine,</w:t>
+      </w:r>
+      <w:r>
+        <w:rPr>
+          <w:lang w:val="en-GB"/>
+        </w:rPr>
+        <w:t xml:space="preserve"> </w:t>
+      </w:r>
+      <w:r>
+        <w:rPr>
+          <w:lang w:val="en-GB"/>
+        </w:rPr>
+        <w:t xml:space="preserve">same distribution to the message — that is the determinism requirement of</w:t>
+      </w:r>
+      <w:r>
+        <w:rPr>
+          <w:lang w:val="en-GB"/>
+        </w:rPr>
+        <w:t xml:space="preserve"> </w:t>
+      </w:r>
+      <w:r>
+        <w:rPr>
+          <w:lang w:val="en-GB"/>
+        </w:rPr>
+        <w:t xml:space="preserve">CLAUDE.md #7 demonstrated rather than asserted.</w:t>
       </w:r>
     </w:p>
     <w:p>

</xml_diff>